<commit_message>
Starta med Forsiden, Er nesten ferdig med forsiden.
</commit_message>
<xml_diff>
--- a/Prosjekt-nettside/Logg.docx
+++ b/Prosjekt-nettside/Logg.docx
@@ -218,6 +218,40 @@
       <w:pPr>
         <w:ind w:left="720"/>
       </w:pPr>
+      <w:r>
+        <w:lastRenderedPageBreak/>
+        <w:t xml:space="preserve">20/10.2026 </w:t>
+      </w:r>
+    </w:p>
+    <w:p>
+      <w:pPr>
+        <w:ind w:left="720"/>
+      </w:pPr>
+      <w:r>
+        <w:t xml:space="preserve">I dag </w:t>
+      </w:r>
+      <w:r>
+        <w:t>så</w:t>
+      </w:r>
+      <w:r>
+        <w:t xml:space="preserve"> jobba jeg med nettsiden, meste parten gjørde jeg hjemme. </w:t>
+      </w:r>
+      <w:r>
+        <w:t xml:space="preserve">Prøver å forstå hvorfor Nav baren ikke funka. </w:t>
+      </w:r>
+    </w:p>
+    <w:p>
+      <w:pPr>
+        <w:ind w:left="720"/>
+      </w:pPr>
+    </w:p>
+    <w:p>
+      <w:pPr>
+        <w:ind w:left="720"/>
+      </w:pPr>
+      <w:r>
+        <w:tab/>
+      </w:r>
     </w:p>
     <w:p/>
     <w:p/>

</xml_diff>